<commit_message>
docs: diario de reflexión y autoevaluación Fase 2. Closes #1, closes #2
</commit_message>
<xml_diff>
--- a/Fase 2/Evidencias Individuales/Cayuqueo_Alex_2_1_APT122_DiarioReflexionFase2.docx
+++ b/Fase 2/Evidencias Individuales/Cayuqueo_Alex_2_1_APT122_DiarioReflexionFase2.docx
@@ -340,7 +340,7 @@
                 <w:color w:val="1F1F1F"/>
                 <w:sz w:val="20"/>
               </w:rPr>
-              <w:t>En general he avanzado según lo planificado en la carta Gantt, e incluso adelanté parte del desarrollo del frontend, que estaba previsto desde la semana 9. Sin embargo, no todas las actividades se cumplieron por completo: la carga del currículum oficial del MINEDUC quedó pendiente y los módulos de recursos y actividades por ahora solo permiten consultar información.</w:t>
+              <w:t>En general he avanzado según lo planificado en la carta Gantt: la base del sistema (modelo de datos, API con autenticación JWT, explorador curricular y frontend conectado a la API) quedó funcionando, e incluso adelanté parte del frontend, que estaba previsto desde la semana 9. Sin embargo, no todas las actividades se cumplieron por completo: la carga del currículum oficial del MINEDUC va con atraso, los módulos de recursos y actividades por ahora solo permiten consultar información y la versión Android (APK) aún no se inicia.</w:t>
             </w:r>
           </w:p>
           <w:p>
@@ -363,6 +363,28 @@
                 <w:sz w:val="20"/>
               </w:rPr>
               <w:t>Entre los factores que facilitaron el avance destaco haber elegido un mismo lenguaje (TypeScript) para frontend y backend, contar con el mockup de Fase 1 como guía de la interfaz y trabajar con Docker, que permite levantar la base de datos con un solo comando. Las principales dificultades fueron técnicas y de entorno: la configuración de Docker en mi computador, los bloqueos de seguridad de npm al instalar dependencias y un problema en la configuración de Git que impedía que GitHub reconociera mis commits.</w:t>
+            </w:r>
+          </w:p>
+          <w:p>
+            <w:pPr>
+              <w:spacing w:before="80" w:after="80"/>
+              <w:jc w:val="both"/>
+              <w:rPr>
+                <w:rFonts w:eastAsiaTheme="majorEastAsia"/>
+                <w:color w:val="767171" w:themeColor="background2" w:themeShade="80"/>
+                <w:sz w:val="24"/>
+                <w:szCs w:val="24"/>
+              </w:rPr>
+            </w:pPr>
+            <w:r>
+              <w:rPr>
+                <w:rFonts w:ascii="Calibri" w:hAnsi="Calibri"/>
+                <w:b w:val="0"/>
+                <w:i w:val="0"/>
+                <w:color w:val="1F1F1F"/>
+                <w:sz w:val="20"/>
+              </w:rPr>
+              <w:t>Además, en la última reunión el docente me pidió entregar un producto completo y no un MVP. Esto amplía el alcance del proyecto (gestión completa de recursos y actividades, planificador con calendario, modo presentación para pantallas interactivas, roles y panel de administración, APK y despliegue en línea) y me obliga a reajustar la planificación de las semanas que quedan.</w:t>
             </w:r>
           </w:p>
         </w:tc>
@@ -499,7 +521,7 @@
                 <w:color w:val="1F1F1F"/>
                 <w:sz w:val="20"/>
               </w:rPr>
-              <w:t>Para lo que queda del proyecto planeo priorizar en el tablero Kanban las tareas que habilitan el uso completo de la aplicación (inicio de sesión y creación de clases), ajustar el modelo de datos antes de cargar el currículum oficial y mantener el registro de evidencias al cierre de cada tarea, para no acumular documentación al final del semestre.</w:t>
+              <w:t>Para enfrentar el nuevo alcance organicé todo el trabajo en un tablero Kanban en GitHub Projects, con las tareas del producto completo en el backlog y un límite de dos tareas en progreso. Priorizo lo que habilita el uso completo de la aplicación (inicio de sesión y planificador de clases) y el modo presentación, que es el diferenciador del proyecto. Cada commit se asocia a su tarjeta del tablero y registro las evidencias al cerrar cada tarea, para no acumular documentación al final del semestre. Además, definí la lista de funcionalidades que considero para el producto completo y la validaré con el docente, para que el alcance quede acordado y sea abordable en el tiempo disponible.</w:t>
             </w:r>
           </w:p>
         </w:tc>
@@ -743,7 +765,7 @@
                 <w:color w:val="1F1F1F"/>
                 <w:sz w:val="20"/>
               </w:rPr>
-              <w:t>Evalúo mi trabajo de forma positiva: logré tener una aplicación funcionando de extremo a extremo, con base de datos, API y frontend conectados, y documenté 15 casos de prueba. Destaco el orden del repositorio, con commits incrementales y descriptivos, y que las pruebas me permitieron detectar mejoras concretas, como los mensajes de error en inglés y la falta de validación de objetivos inexistentes.</w:t>
+              <w:t>Evalúo mi trabajo de forma positiva: logré tener una aplicación funcionando de extremo a extremo, con base de datos, API y frontend conectados, y documenté 15 casos de prueba, todos aprobados. Destaco el orden del repositorio, con commits incrementales y descriptivos, un README completo con instrucciones de ejecución, arquitectura y metodología, y un tablero Kanban donde cada tarea terminada queda vinculada al commit que la respalda. También destaco que las pruebas me permitieron detectar mejoras concretas, como los mensajes de error en inglés y la falta de validación de objetivos inexistentes.</w:t>
             </w:r>
           </w:p>
           <w:p>
@@ -765,7 +787,7 @@
                 <w:color w:val="1F1F1F"/>
                 <w:sz w:val="20"/>
               </w:rPr>
-              <w:t>Para mejorar, debo distribuir el trabajo de forma más constante en el tiempo, ya que concentré gran parte del avance en pocas jornadas. También debo profundizar en la comprensión de cada módulo del código base, para poder explicar y modificar cualquier parte con seguridad, y mantener actualizado el tablero Kanban como reflejo real del avance.</w:t>
+              <w:t>Para mejorar, debo distribuir el trabajo de forma más constante en el tiempo, ya que concentré gran parte del avance en pocas jornadas, algo que ahora es más importante por el aumento de alcance. También debo profundizar en la comprensión de cada módulo del código, para poder explicar y modificar cualquier parte con seguridad, y mantener el tablero Kanban actualizado como reflejo real del avance.</w:t>
             </w:r>
           </w:p>
         </w:tc>
@@ -881,7 +903,7 @@
                 <w:color w:val="1F1F1F"/>
                 <w:sz w:val="20"/>
               </w:rPr>
-              <w:t>Me queda la duda de si, para el informe final, se espera la carga completa del currículum oficial de las asignaturas y niveles definidos en el MVP o si basta con una muestra representativa. También quisiera saber si la versión Android (APK) es un entregable obligatorio o si la versión web cumple con el alcance esperado.</w:t>
+              <w:t>Tras la última reunión me quedó claro que el docente espera un producto completo y no un MVP. Mi principal inquietud ahora es el alcance concreto de ese producto frente al tiempo disponible, ya que trabajo de forma individual: necesito confirmar qué funcionalidades se consideran indispensables para darlo por terminado, si la carga del currículum oficial debe cubrir todos los niveles de 1° básico a 4° medio y si la versión Android (APK) y el despliegue en línea son obligatorios.</w:t>
             </w:r>
           </w:p>
           <w:p>
@@ -903,7 +925,7 @@
                 <w:color w:val="1F1F1F"/>
                 <w:sz w:val="20"/>
               </w:rPr>
-              <w:t>Preguntas para mi docente: ¿Es recomendable validar la aplicación con docentes reales antes del informe final? Al ser un proyecto individual, ¿cómo se evaluarán los criterios de la rúbrica relacionados con el trabajo en equipo y la equidad de aportes en el repositorio?</w:t>
+              <w:t>Preguntas para mi docente: ¿Qué se espera exactamente para la entrega del 30 de octubre: el informe de avance con el producto en desarrollo o el producto terminado? ¿Es recomendable validar la aplicación con docentes reales antes del informe final? Al ser un proyecto individual, ¿cómo se evaluarán los criterios de la rúbrica relacionados con el trabajo en equipo y la equidad de aportes en el repositorio?</w:t>
             </w:r>
           </w:p>
         </w:tc>
@@ -1030,7 +1052,7 @@
                 <w:color w:val="1F1F1F"/>
                 <w:sz w:val="20"/>
               </w:rPr>
-              <w:t>Al ser un proyecto individual, no corresponde redistribuir actividades: todas las tareas de desarrollo, documentación y gestión están a mi cargo. En lugar de redistribuir, el ajuste consiste en repriorizar: las nuevas actividades identificadas (inicio de sesión en el frontend, formulario de nueva clase, ajuste del modelo curricular y mejoras de validación) se incorporaron al tablero Kanban según su impacto en el funcionamiento de la aplicación.</w:t>
+              <w:t>Al ser un proyecto individual, no corresponde redistribuir actividades: todas las tareas de desarrollo, documentación y gestión están a mi cargo. En lugar de redistribuir, el ajuste consiste en repriorizar. Las nuevas actividades que surgen del cambio a producto completo (inicio de sesión y registro en el frontend, planificador completo, modo presentación, carga del currículum oficial, roles y panel de administración, APK, despliegue en línea y pruebas automatizadas) quedaron registradas en el tablero Kanban y se ordenaron según su impacto en el funcionamiento de la aplicación y en la entrega del 30 de octubre.</w:t>
             </w:r>
           </w:p>
         </w:tc>

</xml_diff>